<commit_message>
Improvement of the collapsed sidebar
</commit_message>
<xml_diff>
--- a/Documentation/Отчет_ПДП_Шеронов_41П.docx
+++ b/Documentation/Отчет_ПДП_Шеронов_41П.docx
@@ -29534,7 +29534,59 @@
     <w:p>
       <w:pPr>
         <w:spacing w:after="0" w:line="420" w:lineRule="auto"/>
-        <w:ind w:firstLine="709"/>
+        <w:rPr>
+          <w:rFonts w:ascii="Times New Roman" w:hAnsi="Times New Roman" w:cs="Times New Roman"/>
+          <w:color w:val="000000"/>
+          <w:sz w:val="28"/>
+        </w:rPr>
+      </w:pPr>
+      <w:r>
+        <w:rPr>
+          <w:rFonts w:ascii="Times New Roman" w:hAnsi="Times New Roman" w:cs="Times New Roman"/>
+          <w:color w:val="000000"/>
+          <w:sz w:val="28"/>
+        </w:rPr>
+        <w:drawing>
+          <wp:inline distT="0" distB="0" distL="0" distR="0" wp14:anchorId="1A75B4FC" wp14:editId="1920EFCF">
+            <wp:extent cx="5940425" cy="6295390"/>
+            <wp:effectExtent l="0" t="0" r="3175" b="0"/>
+            <wp:docPr id="1368207898" name="Рисунок 1"/>
+            <wp:cNvGraphicFramePr>
+              <a:graphicFrameLocks xmlns:a="http://schemas.openxmlformats.org/drawingml/2006/main" noChangeAspect="1"/>
+            </wp:cNvGraphicFramePr>
+            <a:graphic xmlns:a="http://schemas.openxmlformats.org/drawingml/2006/main">
+              <a:graphicData uri="http://schemas.openxmlformats.org/drawingml/2006/picture">
+                <pic:pic xmlns:pic="http://schemas.openxmlformats.org/drawingml/2006/picture">
+                  <pic:nvPicPr>
+                    <pic:cNvPr id="1368207898" name=""/>
+                    <pic:cNvPicPr/>
+                  </pic:nvPicPr>
+                  <pic:blipFill>
+                    <a:blip r:embed="rId7"/>
+                    <a:stretch>
+                      <a:fillRect/>
+                    </a:stretch>
+                  </pic:blipFill>
+                  <pic:spPr>
+                    <a:xfrm>
+                      <a:off x="0" y="0"/>
+                      <a:ext cx="5940425" cy="6295390"/>
+                    </a:xfrm>
+                    <a:prstGeom prst="rect">
+                      <a:avLst/>
+                    </a:prstGeom>
+                  </pic:spPr>
+                </pic:pic>
+              </a:graphicData>
+            </a:graphic>
+          </wp:inline>
+        </w:drawing>
+      </w:r>
+    </w:p>
+    <w:p>
+      <w:pPr>
+        <w:spacing w:after="0" w:line="420" w:lineRule="auto"/>
+        <w:jc w:val="center"/>
         <w:rPr>
           <w:rFonts w:ascii="Times New Roman" w:hAnsi="Times New Roman" w:cs="Times New Roman"/>
           <w:color w:val="000000"/>
@@ -29652,6 +29704,7 @@
           <w:color w:val="000000"/>
           <w:sz w:val="28"/>
         </w:rPr>
+        <w:lastRenderedPageBreak/>
         <w:t>Б.6 — Модуль аналитики</w:t>
       </w:r>
     </w:p>
@@ -30166,12 +30219,12 @@
       </w:pPr>
     </w:p>
     <w:sectPr>
-      <w:headerReference w:type="even" r:id="rId7"/>
-      <w:headerReference w:type="default" r:id="rId8"/>
-      <w:footerReference w:type="even" r:id="rId9"/>
-      <w:footerReference w:type="default" r:id="rId10"/>
-      <w:headerReference w:type="first" r:id="rId11"/>
-      <w:footerReference w:type="first" r:id="rId12"/>
+      <w:headerReference w:type="even" r:id="rId8"/>
+      <w:headerReference w:type="default" r:id="rId9"/>
+      <w:footerReference w:type="even" r:id="rId10"/>
+      <w:footerReference w:type="default" r:id="rId11"/>
+      <w:headerReference w:type="first" r:id="rId12"/>
+      <w:footerReference w:type="first" r:id="rId13"/>
       <w:pgSz w:w="11906" w:h="16838"/>
       <w:pgMar w:top="1134" w:right="850" w:bottom="1134" w:left="1701" w:header="708" w:footer="708" w:gutter="0"/>
       <w:cols w:space="708"/>

</xml_diff>